<commit_message>
Still-to-do steps worded in English and Kiswahili; no email card on the student profile
</commit_message>
<xml_diff>
--- a/docs/07_Development_Plan_and_Cost_Estimate_College_Institution_Management_System.docx
+++ b/docs/07_Development_Plan_and_Cost_Estimate_College_Institution_Management_System.docx
@@ -11214,7 +11214,7 @@
                 <w:sz w:val="16"/>
                 <w:szCs w:val="16"/>
               </w:rPr>
-              <w:t>Phase / release</w:t>
+              <w:t>Phase/release</w:t>
             </w:r>
           </w:p>
         </w:tc>
@@ -14386,7 +14386,14 @@
                 <w:sz w:val="17"/>
                 <w:szCs w:val="17"/>
               </w:rPr>
-              <w:t>Process owners / super-users</w:t>
+              <w:t xml:space="preserve">Process </w:t>
+            </w:r>
+            <w:r>
+              <w:rPr>
+                <w:sz w:val="17"/>
+                <w:szCs w:val="17"/>
+              </w:rPr>
+              <w:t>owners/super-users</w:t>
             </w:r>
           </w:p>
         </w:tc>
@@ -24362,7 +24369,17 @@
                 <w:sz w:val="17"/>
                 <w:szCs w:val="17"/>
               </w:rPr>
-              <w:t>Resolution / workaround target</w:t>
+              <w:t>Resolution/workaround</w:t>
+            </w:r>
+            <w:r>
+              <w:rPr>
+                <w:b/>
+                <w:bCs/>
+                <w:color w:val="FFFFFF"/>
+                <w:sz w:val="17"/>
+                <w:szCs w:val="17"/>
+              </w:rPr>
+              <w:t xml:space="preserve"> target</w:t>
             </w:r>
           </w:p>
         </w:tc>

</xml_diff>

<commit_message>
Docs: SRS totals (109/100/9), development plan 3.5 figures, report and code counts, README letters; Kiswahili for 212 more back-office texts and timetable warnings
</commit_message>
<xml_diff>
--- a/docs/07_Development_Plan_and_Cost_Estimate_College_Institution_Management_System.docx
+++ b/docs/07_Development_Plan_and_Cost_Estimate_College_Institution_Management_System.docx
@@ -413,7 +413,7 @@
                 <w:sz w:val="18"/>
                 <w:szCs w:val="18"/>
               </w:rPr>
-              <w:t>Version 3.4 — updated to the system as built after the October 2026 completion batches, for stakeholder review</w:t>
+              <w:t xml:space="preserve">Version 3.5 — updated to the system as built after the October 2026 completion batches, for stakeholder review</w:t>
             </w:r>
           </w:p>
         </w:tc>
@@ -1926,6 +1926,141 @@
                 <w:szCs w:val="18"/>
               </w:rPr>
               <w:t>Progress updated after Batch 11: timetabling. Teaching venues, the weekly class timetable with clash checks, the examination timetable with venues and invigilators, publishing to students (with SMS), and personal timetables for lecturers and students.</w:t>
+            </w:r>
+          </w:p>
+        </w:tc>
+      </w:tr>
+      <w:tr>
+        <w:tblPrEx>
+          <w:tblCellMar>
+            <w:top w:w="0" w:type="dxa"/>
+            <w:bottom w:w="0" w:type="dxa"/>
+          </w:tblCellMar>
+        </w:tblPrEx>
+        <w:trPr>
+          <w:cantSplit/>
+        </w:trPr>
+        <w:tc>
+          <w:tcPr>
+            <w:tcW w:w="1083" w:type="dxa"/>
+            <w:tcBorders>
+              <w:top w:val="single" w:sz="4" w:space="0" w:color="BFC9D6"/>
+              <w:left w:val="single" w:sz="4" w:space="0" w:color="BFC9D6"/>
+              <w:bottom w:val="single" w:sz="4" w:space="0" w:color="BFC9D6"/>
+              <w:right w:val="single" w:sz="4" w:space="0" w:color="BFC9D6"/>
+            </w:tcBorders>
+            <w:shd w:val="clear" w:color="auto" w:fill="EEF3F8"/>
+            <w:tcMar>
+              <w:top w:w="60" w:type="dxa"/>
+              <w:left w:w="100" w:type="dxa"/>
+              <w:bottom w:w="60" w:type="dxa"/>
+              <w:right w:w="100" w:type="dxa"/>
+            </w:tcMar>
+            <w:vAlign w:val="center"/>
+          </w:tcPr>
+          <w:p>
+            <w:pPr>
+              <w:spacing w:before="30" w:after="30"/>
+            </w:pPr>
+            <w:r>
+              <w:rPr>
+                <w:sz w:val="18"/>
+                <w:szCs w:val="18"/>
+              </w:rPr>
+              <w:t xml:space="preserve">3.5</w:t>
+            </w:r>
+          </w:p>
+        </w:tc>
+        <w:tc>
+          <w:tcPr>
+            <w:tcW w:w="1624" w:type="dxa"/>
+            <w:tcBorders>
+              <w:top w:val="single" w:sz="4" w:space="0" w:color="BFC9D6"/>
+              <w:left w:val="single" w:sz="4" w:space="0" w:color="BFC9D6"/>
+              <w:bottom w:val="single" w:sz="4" w:space="0" w:color="BFC9D6"/>
+              <w:right w:val="single" w:sz="4" w:space="0" w:color="BFC9D6"/>
+            </w:tcBorders>
+            <w:shd w:val="clear" w:color="auto" w:fill="EEF3F8"/>
+            <w:tcMar>
+              <w:top w:w="60" w:type="dxa"/>
+              <w:left w:w="100" w:type="dxa"/>
+              <w:bottom w:w="60" w:type="dxa"/>
+              <w:right w:w="100" w:type="dxa"/>
+            </w:tcMar>
+            <w:vAlign w:val="center"/>
+          </w:tcPr>
+          <w:p>
+            <w:pPr>
+              <w:spacing w:before="30" w:after="30"/>
+            </w:pPr>
+            <w:r>
+              <w:rPr>
+                <w:sz w:val="18"/>
+                <w:szCs w:val="18"/>
+              </w:rPr>
+              <w:t xml:space="preserve">October 2026</w:t>
+            </w:r>
+          </w:p>
+        </w:tc>
+        <w:tc>
+          <w:tcPr>
+            <w:tcW w:w="1985" w:type="dxa"/>
+            <w:tcBorders>
+              <w:top w:val="single" w:sz="4" w:space="0" w:color="BFC9D6"/>
+              <w:left w:val="single" w:sz="4" w:space="0" w:color="BFC9D6"/>
+              <w:bottom w:val="single" w:sz="4" w:space="0" w:color="BFC9D6"/>
+              <w:right w:val="single" w:sz="4" w:space="0" w:color="BFC9D6"/>
+            </w:tcBorders>
+            <w:shd w:val="clear" w:color="auto" w:fill="EEF3F8"/>
+            <w:tcMar>
+              <w:top w:w="60" w:type="dxa"/>
+              <w:left w:w="100" w:type="dxa"/>
+              <w:bottom w:w="60" w:type="dxa"/>
+              <w:right w:w="100" w:type="dxa"/>
+            </w:tcMar>
+            <w:vAlign w:val="center"/>
+          </w:tcPr>
+          <w:p>
+            <w:pPr>
+              <w:spacing w:before="30" w:after="30"/>
+            </w:pPr>
+            <w:r>
+              <w:rPr>
+                <w:sz w:val="18"/>
+                <w:szCs w:val="18"/>
+              </w:rPr>
+              <w:t xml:space="preserve">Msingi Technologies Ltd</w:t>
+            </w:r>
+          </w:p>
+        </w:tc>
+        <w:tc>
+          <w:tcPr>
+            <w:tcW w:w="4334" w:type="dxa"/>
+            <w:tcBorders>
+              <w:top w:val="single" w:sz="4" w:space="0" w:color="BFC9D6"/>
+              <w:left w:val="single" w:sz="4" w:space="0" w:color="BFC9D6"/>
+              <w:bottom w:val="single" w:sz="4" w:space="0" w:color="BFC9D6"/>
+              <w:right w:val="single" w:sz="4" w:space="0" w:color="BFC9D6"/>
+            </w:tcBorders>
+            <w:shd w:val="clear" w:color="auto" w:fill="EEF3F8"/>
+            <w:tcMar>
+              <w:top w:w="60" w:type="dxa"/>
+              <w:left w:w="100" w:type="dxa"/>
+              <w:bottom w:w="60" w:type="dxa"/>
+              <w:right w:w="100" w:type="dxa"/>
+            </w:tcMar>
+            <w:vAlign w:val="center"/>
+          </w:tcPr>
+          <w:p>
+            <w:pPr>
+              <w:spacing w:before="30" w:after="30"/>
+            </w:pPr>
+            <w:r>
+              <w:rPr>
+                <w:sz w:val="18"/>
+                <w:szCs w:val="18"/>
+              </w:rPr>
+              <w:t xml:space="preserve">Progress figures brought up to date (183 tables, 59 migrations, 251 backend tests, 37 reports); Release 1 note adds programme pages and adverts, the helpdesk and Msingi billing.</w:t>
             </w:r>
           </w:p>
         </w:tc>
@@ -11142,11 +11277,7 @@
         <w:jc w:val="both"/>
       </w:pPr>
       <w:r>
-        <w:t xml:space="preserve">The build was done ahead of the 2 November 2026 start assumed above. The system has 164 database tables from 52 migrations, about 55,000 lines of backend and 26,000 lines of frontend code, 250 automated </w:t>
-      </w:r>
-      <w:r>
-        <w:lastRenderedPageBreak/>
-        <w:t>backend tests and frontend unit tests, 35 standard reports and 20 roles, with every screen in English and Kiswahili. Its status against the planned phases:</w:t>
+        <w:t xml:space="preserve">The build was done ahead of the 2 November 2026 start assumed above. The system has 183 database tables from 59 migrations, about 66,000 lines of backend and 32,000 lines of frontend code, 251 automated backend tests in 81 test classes, 13 frontend unit tests and 13 end-to-end tests run in three browsers, 37 standard reports, 20 roles and 14 scheduled jobs, with every screen in English and Kiswahili. Its status against the planned phases:</w:t>
       </w:r>
     </w:p>
     <w:tbl>
@@ -11723,7 +11854,7 @@
                 <w:sz w:val="16"/>
                 <w:szCs w:val="16"/>
               </w:rPr>
-              <w:t>Platform, admission portal with document uploads, NECTA and NACTVET look-ups, selection, NACTVET verification, letters (editable wording, emailed), registry, fees and GePG (live adapter built), SMS and email, reports, student portal.</w:t>
+              <w:t xml:space="preserve">Platform, admission portal with document uploads, NECTA and NACTVET look-ups, selection, NACTVET verification, letters (editable wording, emailed), registry, fees and GePG (live adapter built), SMS and email, reports, student portal; programme pages with share links and advert posters; helpdesk with the built-in assistant; Msingi billing of institutions.</w:t>
             </w:r>
           </w:p>
         </w:tc>
@@ -23498,7 +23629,7 @@
           <w:b/>
           <w:bCs/>
         </w:rPr>
-        <w:t>As built: 250 automated backend tests in 73 test classes run against a real PostgreSQL database, including tenant isolation, the job lock, integration adapters against simulators of NACTVET, GePG, HESLB, NIDA, MUSE and TAMISEMI, and regulation calculations (grading, GPA, decisions); frontend unit tests cover the Kiswahili translation layer; Playwright end-to-end and accessibility tests run in Chromium, Firefox and WebKit; continuous integration runs them with Trivy, npm audit and an OWASP ZAP baseline, and k6 and Locust load tests are scripted. Still to do: coverage measurement, golden datasets confirmed by examinations officers, system integration against the bodies' test environments, the peak load test on staging, the penetration test, and pilot acceptance.</w:t>
+        <w:t xml:space="preserve">As built: 251 automated backend tests in 81 test classes run against a real PostgreSQL database, including tenant isolation, the job lock, integration adapters against simulators of NACTVET, GePG, HESLB, NIDA, MUSE and TAMISEMI, and regulation calculations (grading, GPA, decisions); frontend unit tests cover the Kiswahili translation layer; Playwright end-to-end and accessibility tests run in Chromium, Firefox and WebKit; continuous integration runs them with Trivy, npm audit and an OWASP ZAP baseline, and k6 and Locust load tests are scripted. Still to do: coverage measurement, golden datasets confirmed by examinations officers, system integration against the bodies' test environments, the peak load test on staging, the penetration test, and pilot acceptance.</w:t>
       </w:r>
     </w:p>
     <w:p>

</xml_diff>